<commit_message>
Prepare EquWord 1.0.0 candidate and platform Quick Starts
</commit_message>
<xml_diff>
--- a/package/Tutorial/REF_Practice.docx
+++ b/package/Tutorial/REF_Practice.docx
@@ -10,7 +10,7 @@
         <w:ind w:firstLine="0"/>
       </w:pPr>
       <w:r>
-        <w:t>Research Equation Formatter Practice Document</w:t>
+        <w:t>EquWord Practice Document</w:t>
       </w:r>
     </w:p>
     <w:p>
@@ -21,7 +21,7 @@
         <w:jc w:val="center"/>
       </w:pPr>
       <w:r>
-        <w:t>Version 0.9.27</w:t>
+        <w:t>Version 1.0.0</w:t>
       </w:r>
     </w:p>
     <w:p>
@@ -30,7 +30,7 @@
         <w:spacing w:before="0" w:after="0" w:line="480" w:lineRule="auto"/>
       </w:pPr>
       <w:r>
-        <w:t>Save a copy before you begin. Use the illustrated Quick Start to load the template and configure this document. The body text uses Times New Roman 12 pt with double spacing.</w:t>
+        <w:t>Save a copy before you begin. Use the Quick Start for your operating system to load the template and configure this document. The body text uses Times New Roman 12 pt with double spacing.</w:t>
       </w:r>
     </w:p>
     <w:p>
@@ -387,7 +387,7 @@
         <w:spacing w:before="0" w:after="0" w:line="480" w:lineRule="auto"/>
       </w:pPr>
       <w:r>
-        <w:t>After the run, review the result dialog and the equation number. In Word, Alt+F9 toggles field codes so you can inspect the SEQ and REF fields; press Alt+F9 again to return to their displayed values.</w:t>
+        <w:t>After the run, review the result dialog and the equation number. To inspect SEQ and REF field codes, use Alt+F9 on Windows or Option+F9 on Mac (Fn may be needed). Use the same shortcut again to return to displayed values.</w:t>
       </w:r>
     </w:p>
     <w:p>

</xml_diff>